<commit_message>
Align portfolio with resume: keep reconciliation project and data automation suite only; remove artifacts not listed on resume
</commit_message>
<xml_diff>
--- a/01-Mizan-Invoice-Bank-Reconciliation/01-Requirements/Mizan_BRD_Excerpts.docx
+++ b/01-Mizan-Invoice-Bank-Reconciliation/01-Requirements/Mizan_BRD_Excerpts.docx
@@ -2105,7 +2105,7 @@
                 <w:rFonts w:ascii="Arial" w:hAnsi="Arial"/>
                 <w:sz w:val="17"/>
               </w:rPr>
-              <w:t xml:space="preserve">Provide KPI dashboard and exception tracker</w:t>
+              <w:t xml:space="preserve">Provide KPI workbook and exception tracker (match rate, clearance velocity, daily resolution rate)</w:t>
             </w:r>
           </w:p>
         </w:tc>
@@ -3809,7 +3809,7 @@
                 <w:rFonts w:ascii="Arial" w:hAnsi="Arial"/>
                 <w:sz w:val="17"/>
               </w:rPr>
-              <w:t xml:space="preserve">Dashboard and tracker</w:t>
+              <w:t xml:space="preserve">KPI workbook and exception tracker</w:t>
             </w:r>
           </w:p>
         </w:tc>

</xml_diff>